<commit_message>
feat: integrate RAG into ClientAgent + update project state v1.2.2
- _build_rag_recommendations: top-3 categorías por affinity_score (JOIN Product) + search_products semántico
- Firmas backward-compatible en pre_visit_notification, no_visit_followup, respond_to_client
- Graceful degradation: captura excepciones, loguea rag_recommendations_failed, retorna []
- docs/go_to_market/Agente_Comercial_IA_Resumen_Ejecutivo.docx actualizado
- ESTADO_PROYECTO.md v1.2.2 + ROADMAP.md v1.2.2

Co-Authored-By: Claude Sonnet 4.6 <noreply@anthropic.com>
</commit_message>
<xml_diff>
--- a/docs/go_to_market/Agente_Comercial_IA_Resumen_Ejecutivo.docx
+++ b/docs/go_to_market/Agente_Comercial_IA_Resumen_Ejecutivo.docx
@@ -2414,7 +2414,1008 @@
     </w:p>
     <w:p>
       <w:pPr>
-        <w:spacing w:after="80" w:before="200"/>
+        <w:spacing w:after="80" w:before="160"/>
+        <w:jc w:val="left"/>
+      </w:pPr>
+      <w:r>
+        <w:rPr>
+          <w:rFonts w:ascii="Arial" w:cs="Arial" w:eastAsia="Arial" w:hAnsi="Arial"/>
+          <w:b w:val="false"/>
+          <w:bCs w:val="false"/>
+          <w:i w:val="false"/>
+          <w:iCs w:val="false"/>
+          <w:color w:val="000000"/>
+          <w:sz w:val="22"/>
+          <w:szCs w:val="22"/>
+        </w:rPr>
+        <w:t xml:space="preserve"/>
+      </w:r>
+    </w:p>
+    <w:p>
+      <w:pPr>
+        <w:pStyle w:val="Heading2"/>
+        <w:spacing w:after="80" w:before="220"/>
+      </w:pPr>
+      <w:r>
+        <w:rPr>
+          <w:rFonts w:ascii="Arial" w:cs="Arial" w:eastAsia="Arial" w:hAnsi="Arial"/>
+          <w:b/>
+          <w:bCs/>
+          <w:color w:val="1B3A6B"/>
+          <w:sz w:val="26"/>
+          <w:szCs w:val="26"/>
+        </w:rPr>
+        <w:t xml:space="preserve">Resultados esperados al cierre del piloto</w:t>
+      </w:r>
+    </w:p>
+    <w:p>
+      <w:pPr>
+        <w:spacing w:after="120" w:before="80"/>
+        <w:jc w:val="left"/>
+      </w:pPr>
+      <w:r>
+        <w:rPr>
+          <w:rFonts w:ascii="Arial" w:cs="Arial" w:eastAsia="Arial" w:hAnsi="Arial"/>
+          <w:b w:val="false"/>
+          <w:bCs w:val="false"/>
+          <w:i w:val="false"/>
+          <w:iCs w:val="false"/>
+          <w:color w:val="4A4A4A"/>
+          <w:sz w:val="22"/>
+          <w:szCs w:val="22"/>
+        </w:rPr>
+        <w:t xml:space="preserve">Basados en operaciones similares en distribución minorista independiente en Colombia y LATAM, estos son los rangos de mejora que el piloto busca demostrar con sus propios datos:</w:t>
+      </w:r>
+    </w:p>
+    <w:tbl>
+      <w:tblPr>
+        <w:tblW w:type="dxa" w:w="9026"/>
+        <w:tblBorders>
+          <w:top w:val="single" w:color="auto" w:sz="4"/>
+          <w:left w:val="single" w:color="auto" w:sz="4"/>
+          <w:bottom w:val="single" w:color="auto" w:sz="4"/>
+          <w:right w:val="single" w:color="auto" w:sz="4"/>
+          <w:insideH w:val="single" w:color="auto" w:sz="4"/>
+          <w:insideV w:val="single" w:color="auto" w:sz="4"/>
+        </w:tblBorders>
+      </w:tblPr>
+      <w:tblGrid>
+        <w:gridCol w:w="3800"/>
+        <w:gridCol w:w="2213"/>
+        <w:gridCol w:w="3013"/>
+      </w:tblGrid>
+      <w:tr>
+        <w:tc>
+          <w:tcPr>
+            <w:tcW w:type="dxa" w:w="3800"/>
+            <w:gridSpan w:val="1"/>
+            <w:tcBorders>
+              <w:top w:val="single" w:color="1B3A6B" w:sz="4"/>
+              <w:left w:val="single" w:color="1B3A6B" w:sz="4"/>
+              <w:bottom w:val="single" w:color="1B3A6B" w:sz="4"/>
+              <w:right w:val="single" w:color="1B3A6B" w:sz="4"/>
+            </w:tcBorders>
+            <w:shd w:fill="1B3A6B" w:val="clear"/>
+            <w:tcMar>
+              <w:top w:type="dxa" w:w="100"/>
+              <w:left w:type="dxa" w:w="140"/>
+              <w:bottom w:type="dxa" w:w="100"/>
+              <w:right w:type="dxa" w:w="140"/>
+            </w:tcMar>
+            <w:vAlign w:val="center"/>
+          </w:tcPr>
+          <w:p>
+            <w:pPr>
+              <w:spacing w:after="80" w:before="80"/>
+              <w:jc w:val="center"/>
+            </w:pPr>
+            <w:r>
+              <w:rPr>
+                <w:rFonts w:ascii="Arial" w:cs="Arial" w:eastAsia="Arial" w:hAnsi="Arial"/>
+                <w:b/>
+                <w:bCs/>
+                <w:i w:val="false"/>
+                <w:iCs w:val="false"/>
+                <w:color w:val="FFFFFF"/>
+                <w:sz w:val="20"/>
+                <w:szCs w:val="20"/>
+              </w:rPr>
+              <w:t xml:space="preserve">Indicador</w:t>
+            </w:r>
+          </w:p>
+        </w:tc>
+        <w:tc>
+          <w:tcPr>
+            <w:tcW w:type="dxa" w:w="2213"/>
+            <w:gridSpan w:val="1"/>
+            <w:tcBorders>
+              <w:top w:val="single" w:color="1B3A6B" w:sz="4"/>
+              <w:left w:val="single" w:color="1B3A6B" w:sz="4"/>
+              <w:bottom w:val="single" w:color="1B3A6B" w:sz="4"/>
+              <w:right w:val="single" w:color="1B3A6B" w:sz="4"/>
+            </w:tcBorders>
+            <w:shd w:fill="1B3A6B" w:val="clear"/>
+            <w:tcMar>
+              <w:top w:type="dxa" w:w="100"/>
+              <w:left w:type="dxa" w:w="140"/>
+              <w:bottom w:type="dxa" w:w="100"/>
+              <w:right w:type="dxa" w:w="140"/>
+            </w:tcMar>
+            <w:vAlign w:val="center"/>
+          </w:tcPr>
+          <w:p>
+            <w:pPr>
+              <w:spacing w:after="80" w:before="80"/>
+              <w:jc w:val="center"/>
+            </w:pPr>
+            <w:r>
+              <w:rPr>
+                <w:rFonts w:ascii="Arial" w:cs="Arial" w:eastAsia="Arial" w:hAnsi="Arial"/>
+                <w:b/>
+                <w:bCs/>
+                <w:i w:val="false"/>
+                <w:iCs w:val="false"/>
+                <w:color w:val="FFFFFF"/>
+                <w:sz w:val="20"/>
+                <w:szCs w:val="20"/>
+              </w:rPr>
+              <w:t xml:space="preserve">Línea base típica</w:t>
+            </w:r>
+          </w:p>
+        </w:tc>
+        <w:tc>
+          <w:tcPr>
+            <w:tcW w:type="dxa" w:w="3013"/>
+            <w:gridSpan w:val="1"/>
+            <w:tcBorders>
+              <w:top w:val="single" w:color="1B3A6B" w:sz="4"/>
+              <w:left w:val="single" w:color="1B3A6B" w:sz="4"/>
+              <w:bottom w:val="single" w:color="1B3A6B" w:sz="4"/>
+              <w:right w:val="single" w:color="1B3A6B" w:sz="4"/>
+            </w:tcBorders>
+            <w:shd w:fill="1A6B3A" w:val="clear"/>
+            <w:tcMar>
+              <w:top w:type="dxa" w:w="100"/>
+              <w:left w:type="dxa" w:w="140"/>
+              <w:bottom w:type="dxa" w:w="100"/>
+              <w:right w:type="dxa" w:w="140"/>
+            </w:tcMar>
+            <w:vAlign w:val="center"/>
+          </w:tcPr>
+          <w:p>
+            <w:pPr>
+              <w:spacing w:after="80" w:before="80"/>
+              <w:jc w:val="center"/>
+            </w:pPr>
+            <w:r>
+              <w:rPr>
+                <w:rFonts w:ascii="Arial" w:cs="Arial" w:eastAsia="Arial" w:hAnsi="Arial"/>
+                <w:b/>
+                <w:bCs/>
+                <w:i w:val="false"/>
+                <w:iCs w:val="false"/>
+                <w:color w:val="FFFFFF"/>
+                <w:sz w:val="20"/>
+                <w:szCs w:val="20"/>
+              </w:rPr>
+              <w:t xml:space="preserve">Objetivo del piloto</w:t>
+            </w:r>
+          </w:p>
+        </w:tc>
+      </w:tr>
+      <w:tr>
+        <w:tc>
+          <w:tcPr>
+            <w:tcW w:type="dxa" w:w="3800"/>
+            <w:gridSpan w:val="1"/>
+            <w:tcBorders>
+              <w:top w:val="single" w:color="CCCCCC" w:sz="4"/>
+              <w:left w:val="single" w:color="CCCCCC" w:sz="4"/>
+              <w:bottom w:val="single" w:color="CCCCCC" w:sz="4"/>
+              <w:right w:val="single" w:color="CCCCCC" w:sz="4"/>
+            </w:tcBorders>
+            <w:shd w:fill="E8EEF7" w:val="clear"/>
+            <w:tcMar>
+              <w:top w:type="dxa" w:w="100"/>
+              <w:left w:type="dxa" w:w="140"/>
+              <w:bottom w:type="dxa" w:w="100"/>
+              <w:right w:type="dxa" w:w="140"/>
+            </w:tcMar>
+            <w:vAlign w:val="center"/>
+          </w:tcPr>
+          <w:p>
+            <w:pPr>
+              <w:spacing w:after="80" w:before="80"/>
+              <w:jc w:val="left"/>
+            </w:pPr>
+            <w:r>
+              <w:rPr>
+                <w:rFonts w:ascii="Arial" w:cs="Arial" w:eastAsia="Arial" w:hAnsi="Arial"/>
+                <w:b/>
+                <w:bCs/>
+                <w:i w:val="false"/>
+                <w:iCs w:val="false"/>
+                <w:color w:val="1B3A6B"/>
+                <w:sz w:val="21"/>
+                <w:szCs w:val="21"/>
+              </w:rPr>
+              <w:t xml:space="preserve">ROI estimado sobre inversión mensual</w:t>
+            </w:r>
+          </w:p>
+        </w:tc>
+        <w:tc>
+          <w:tcPr>
+            <w:tcW w:type="dxa" w:w="2213"/>
+            <w:gridSpan w:val="1"/>
+            <w:tcBorders>
+              <w:top w:val="single" w:color="CCCCCC" w:sz="4"/>
+              <w:left w:val="single" w:color="CCCCCC" w:sz="4"/>
+              <w:bottom w:val="single" w:color="CCCCCC" w:sz="4"/>
+              <w:right w:val="single" w:color="CCCCCC" w:sz="4"/>
+            </w:tcBorders>
+            <w:shd w:fill="E8EEF7" w:val="clear"/>
+            <w:tcMar>
+              <w:top w:type="dxa" w:w="100"/>
+              <w:left w:type="dxa" w:w="140"/>
+              <w:bottom w:type="dxa" w:w="100"/>
+              <w:right w:type="dxa" w:w="140"/>
+            </w:tcMar>
+            <w:vAlign w:val="center"/>
+          </w:tcPr>
+          <w:p>
+            <w:pPr>
+              <w:spacing w:after="80" w:before="80"/>
+              <w:jc w:val="center"/>
+            </w:pPr>
+            <w:r>
+              <w:rPr>
+                <w:rFonts w:ascii="Arial" w:cs="Arial" w:eastAsia="Arial" w:hAnsi="Arial"/>
+                <w:b w:val="false"/>
+                <w:bCs w:val="false"/>
+                <w:i w:val="false"/>
+                <w:iCs w:val="false"/>
+                <w:color w:val="000000"/>
+                <w:sz w:val="21"/>
+                <w:szCs w:val="21"/>
+              </w:rPr>
+              <w:t xml:space="preserve">—</w:t>
+            </w:r>
+          </w:p>
+        </w:tc>
+        <w:tc>
+          <w:tcPr>
+            <w:tcW w:type="dxa" w:w="3013"/>
+            <w:gridSpan w:val="1"/>
+            <w:tcBorders>
+              <w:top w:val="single" w:color="CCCCCC" w:sz="4"/>
+              <w:left w:val="single" w:color="CCCCCC" w:sz="4"/>
+              <w:bottom w:val="single" w:color="CCCCCC" w:sz="4"/>
+              <w:right w:val="single" w:color="CCCCCC" w:sz="4"/>
+            </w:tcBorders>
+            <w:shd w:fill="EAF4EE" w:val="clear"/>
+            <w:tcMar>
+              <w:top w:type="dxa" w:w="100"/>
+              <w:left w:type="dxa" w:w="140"/>
+              <w:bottom w:type="dxa" w:w="100"/>
+              <w:right w:type="dxa" w:w="140"/>
+            </w:tcMar>
+            <w:vAlign w:val="center"/>
+          </w:tcPr>
+          <w:p>
+            <w:pPr>
+              <w:spacing w:after="80" w:before="80"/>
+              <w:jc w:val="center"/>
+            </w:pPr>
+            <w:r>
+              <w:rPr>
+                <w:rFonts w:ascii="Arial" w:cs="Arial" w:eastAsia="Arial" w:hAnsi="Arial"/>
+                <w:b/>
+                <w:bCs/>
+                <w:i w:val="false"/>
+                <w:iCs w:val="false"/>
+                <w:color w:val="1A6B3A"/>
+                <w:sz w:val="21"/>
+                <w:szCs w:val="21"/>
+              </w:rPr>
+              <w:t xml:space="preserve">5x – 10x</w:t>
+            </w:r>
+          </w:p>
+        </w:tc>
+      </w:tr>
+      <w:tr>
+        <w:tc>
+          <w:tcPr>
+            <w:tcW w:type="dxa" w:w="3800"/>
+            <w:gridSpan w:val="1"/>
+            <w:tcBorders>
+              <w:top w:val="single" w:color="CCCCCC" w:sz="4"/>
+              <w:left w:val="single" w:color="CCCCCC" w:sz="4"/>
+              <w:bottom w:val="single" w:color="CCCCCC" w:sz="4"/>
+              <w:right w:val="single" w:color="CCCCCC" w:sz="4"/>
+            </w:tcBorders>
+            <w:shd w:fill="FFFFFF" w:val="clear"/>
+            <w:tcMar>
+              <w:top w:type="dxa" w:w="100"/>
+              <w:left w:type="dxa" w:w="140"/>
+              <w:bottom w:type="dxa" w:w="100"/>
+              <w:right w:type="dxa" w:w="140"/>
+            </w:tcMar>
+            <w:vAlign w:val="center"/>
+          </w:tcPr>
+          <w:p>
+            <w:pPr>
+              <w:spacing w:after="80" w:before="80"/>
+              <w:jc w:val="left"/>
+            </w:pPr>
+            <w:r>
+              <w:rPr>
+                <w:rFonts w:ascii="Arial" w:cs="Arial" w:eastAsia="Arial" w:hAnsi="Arial"/>
+                <w:b w:val="false"/>
+                <w:bCs w:val="false"/>
+                <w:i w:val="false"/>
+                <w:iCs w:val="false"/>
+                <w:color w:val="000000"/>
+                <w:sz w:val="21"/>
+                <w:szCs w:val="21"/>
+              </w:rPr>
+              <w:t xml:space="preserve">Pedidos recuperados sin visita presencial</w:t>
+            </w:r>
+          </w:p>
+        </w:tc>
+        <w:tc>
+          <w:tcPr>
+            <w:tcW w:type="dxa" w:w="2213"/>
+            <w:gridSpan w:val="1"/>
+            <w:tcBorders>
+              <w:top w:val="single" w:color="CCCCCC" w:sz="4"/>
+              <w:left w:val="single" w:color="CCCCCC" w:sz="4"/>
+              <w:bottom w:val="single" w:color="CCCCCC" w:sz="4"/>
+              <w:right w:val="single" w:color="CCCCCC" w:sz="4"/>
+            </w:tcBorders>
+            <w:shd w:fill="FFFFFF" w:val="clear"/>
+            <w:tcMar>
+              <w:top w:type="dxa" w:w="100"/>
+              <w:left w:type="dxa" w:w="140"/>
+              <w:bottom w:type="dxa" w:w="100"/>
+              <w:right w:type="dxa" w:w="140"/>
+            </w:tcMar>
+            <w:vAlign w:val="center"/>
+          </w:tcPr>
+          <w:p>
+            <w:pPr>
+              <w:spacing w:after="80" w:before="80"/>
+              <w:jc w:val="center"/>
+            </w:pPr>
+            <w:r>
+              <w:rPr>
+                <w:rFonts w:ascii="Arial" w:cs="Arial" w:eastAsia="Arial" w:hAnsi="Arial"/>
+                <w:b w:val="false"/>
+                <w:bCs w:val="false"/>
+                <w:i w:val="false"/>
+                <w:iCs w:val="false"/>
+                <w:color w:val="000000"/>
+                <w:sz w:val="21"/>
+                <w:szCs w:val="21"/>
+              </w:rPr>
+              <w:t xml:space="preserve">0%</w:t>
+            </w:r>
+          </w:p>
+        </w:tc>
+        <w:tc>
+          <w:tcPr>
+            <w:tcW w:type="dxa" w:w="3013"/>
+            <w:gridSpan w:val="1"/>
+            <w:tcBorders>
+              <w:top w:val="single" w:color="CCCCCC" w:sz="4"/>
+              <w:left w:val="single" w:color="CCCCCC" w:sz="4"/>
+              <w:bottom w:val="single" w:color="CCCCCC" w:sz="4"/>
+              <w:right w:val="single" w:color="CCCCCC" w:sz="4"/>
+            </w:tcBorders>
+            <w:shd w:fill="FFFFFF" w:val="clear"/>
+            <w:tcMar>
+              <w:top w:type="dxa" w:w="100"/>
+              <w:left w:type="dxa" w:w="140"/>
+              <w:bottom w:type="dxa" w:w="100"/>
+              <w:right w:type="dxa" w:w="140"/>
+            </w:tcMar>
+            <w:vAlign w:val="center"/>
+          </w:tcPr>
+          <w:p>
+            <w:pPr>
+              <w:spacing w:after="80" w:before="80"/>
+              <w:jc w:val="center"/>
+            </w:pPr>
+            <w:r>
+              <w:rPr>
+                <w:rFonts w:ascii="Arial" w:cs="Arial" w:eastAsia="Arial" w:hAnsi="Arial"/>
+                <w:b/>
+                <w:bCs/>
+                <w:i w:val="false"/>
+                <w:iCs w:val="false"/>
+                <w:color w:val="1A6B3A"/>
+                <w:sz w:val="21"/>
+                <w:szCs w:val="21"/>
+              </w:rPr>
+              <w:t xml:space="preserve">30–50 pedidos/mes adicionales</w:t>
+            </w:r>
+          </w:p>
+        </w:tc>
+      </w:tr>
+      <w:tr>
+        <w:tc>
+          <w:tcPr>
+            <w:tcW w:type="dxa" w:w="3800"/>
+            <w:gridSpan w:val="1"/>
+            <w:tcBorders>
+              <w:top w:val="single" w:color="CCCCCC" w:sz="4"/>
+              <w:left w:val="single" w:color="CCCCCC" w:sz="4"/>
+              <w:bottom w:val="single" w:color="CCCCCC" w:sz="4"/>
+              <w:right w:val="single" w:color="CCCCCC" w:sz="4"/>
+            </w:tcBorders>
+            <w:shd w:fill="E8EEF7" w:val="clear"/>
+            <w:tcMar>
+              <w:top w:type="dxa" w:w="100"/>
+              <w:left w:type="dxa" w:w="140"/>
+              <w:bottom w:type="dxa" w:w="100"/>
+              <w:right w:type="dxa" w:w="140"/>
+            </w:tcMar>
+            <w:vAlign w:val="center"/>
+          </w:tcPr>
+          <w:p>
+            <w:pPr>
+              <w:spacing w:after="80" w:before="80"/>
+              <w:jc w:val="left"/>
+            </w:pPr>
+            <w:r>
+              <w:rPr>
+                <w:rFonts w:ascii="Arial" w:cs="Arial" w:eastAsia="Arial" w:hAnsi="Arial"/>
+                <w:b w:val="false"/>
+                <w:bCs w:val="false"/>
+                <w:i w:val="false"/>
+                <w:iCs w:val="false"/>
+                <w:color w:val="000000"/>
+                <w:sz w:val="21"/>
+                <w:szCs w:val="21"/>
+              </w:rPr>
+              <w:t xml:space="preserve">Frecuencia de compra por cliente</w:t>
+            </w:r>
+          </w:p>
+        </w:tc>
+        <w:tc>
+          <w:tcPr>
+            <w:tcW w:type="dxa" w:w="2213"/>
+            <w:gridSpan w:val="1"/>
+            <w:tcBorders>
+              <w:top w:val="single" w:color="CCCCCC" w:sz="4"/>
+              <w:left w:val="single" w:color="CCCCCC" w:sz="4"/>
+              <w:bottom w:val="single" w:color="CCCCCC" w:sz="4"/>
+              <w:right w:val="single" w:color="CCCCCC" w:sz="4"/>
+            </w:tcBorders>
+            <w:shd w:fill="E8EEF7" w:val="clear"/>
+            <w:tcMar>
+              <w:top w:type="dxa" w:w="100"/>
+              <w:left w:type="dxa" w:w="140"/>
+              <w:bottom w:type="dxa" w:w="100"/>
+              <w:right w:type="dxa" w:w="140"/>
+            </w:tcMar>
+            <w:vAlign w:val="center"/>
+          </w:tcPr>
+          <w:p>
+            <w:pPr>
+              <w:spacing w:after="80" w:before="80"/>
+              <w:jc w:val="center"/>
+            </w:pPr>
+            <w:r>
+              <w:rPr>
+                <w:rFonts w:ascii="Arial" w:cs="Arial" w:eastAsia="Arial" w:hAnsi="Arial"/>
+                <w:b w:val="false"/>
+                <w:bCs w:val="false"/>
+                <w:i w:val="false"/>
+                <w:iCs w:val="false"/>
+                <w:color w:val="000000"/>
+                <w:sz w:val="21"/>
+                <w:szCs w:val="21"/>
+              </w:rPr>
+              <w:t xml:space="preserve">Cada 10–12 días</w:t>
+            </w:r>
+          </w:p>
+        </w:tc>
+        <w:tc>
+          <w:tcPr>
+            <w:tcW w:type="dxa" w:w="3013"/>
+            <w:gridSpan w:val="1"/>
+            <w:tcBorders>
+              <w:top w:val="single" w:color="CCCCCC" w:sz="4"/>
+              <w:left w:val="single" w:color="CCCCCC" w:sz="4"/>
+              <w:bottom w:val="single" w:color="CCCCCC" w:sz="4"/>
+              <w:right w:val="single" w:color="CCCCCC" w:sz="4"/>
+            </w:tcBorders>
+            <w:shd w:fill="EAF4EE" w:val="clear"/>
+            <w:tcMar>
+              <w:top w:type="dxa" w:w="100"/>
+              <w:left w:type="dxa" w:w="140"/>
+              <w:bottom w:type="dxa" w:w="100"/>
+              <w:right w:type="dxa" w:w="140"/>
+            </w:tcMar>
+            <w:vAlign w:val="center"/>
+          </w:tcPr>
+          <w:p>
+            <w:pPr>
+              <w:spacing w:after="80" w:before="80"/>
+              <w:jc w:val="center"/>
+            </w:pPr>
+            <w:r>
+              <w:rPr>
+                <w:rFonts w:ascii="Arial" w:cs="Arial" w:eastAsia="Arial" w:hAnsi="Arial"/>
+                <w:b/>
+                <w:bCs/>
+                <w:i w:val="false"/>
+                <w:iCs w:val="false"/>
+                <w:color w:val="1A6B3A"/>
+                <w:sz w:val="21"/>
+                <w:szCs w:val="21"/>
+              </w:rPr>
+              <w:t xml:space="preserve">Cada 7–9 días (+15–30%)</w:t>
+            </w:r>
+          </w:p>
+        </w:tc>
+      </w:tr>
+      <w:tr>
+        <w:tc>
+          <w:tcPr>
+            <w:tcW w:type="dxa" w:w="3800"/>
+            <w:gridSpan w:val="1"/>
+            <w:tcBorders>
+              <w:top w:val="single" w:color="CCCCCC" w:sz="4"/>
+              <w:left w:val="single" w:color="CCCCCC" w:sz="4"/>
+              <w:bottom w:val="single" w:color="CCCCCC" w:sz="4"/>
+              <w:right w:val="single" w:color="CCCCCC" w:sz="4"/>
+            </w:tcBorders>
+            <w:shd w:fill="FFFFFF" w:val="clear"/>
+            <w:tcMar>
+              <w:top w:type="dxa" w:w="100"/>
+              <w:left w:type="dxa" w:w="140"/>
+              <w:bottom w:type="dxa" w:w="100"/>
+              <w:right w:type="dxa" w:w="140"/>
+            </w:tcMar>
+            <w:vAlign w:val="center"/>
+          </w:tcPr>
+          <w:p>
+            <w:pPr>
+              <w:spacing w:after="80" w:before="80"/>
+              <w:jc w:val="left"/>
+            </w:pPr>
+            <w:r>
+              <w:rPr>
+                <w:rFonts w:ascii="Arial" w:cs="Arial" w:eastAsia="Arial" w:hAnsi="Arial"/>
+                <w:b w:val="false"/>
+                <w:bCs w:val="false"/>
+                <w:i w:val="false"/>
+                <w:iCs w:val="false"/>
+                <w:color w:val="000000"/>
+                <w:sz w:val="21"/>
+                <w:szCs w:val="21"/>
+              </w:rPr>
+              <w:t xml:space="preserve">Efectividad del equipo comercial</w:t>
+            </w:r>
+          </w:p>
+        </w:tc>
+        <w:tc>
+          <w:tcPr>
+            <w:tcW w:type="dxa" w:w="2213"/>
+            <w:gridSpan w:val="1"/>
+            <w:tcBorders>
+              <w:top w:val="single" w:color="CCCCCC" w:sz="4"/>
+              <w:left w:val="single" w:color="CCCCCC" w:sz="4"/>
+              <w:bottom w:val="single" w:color="CCCCCC" w:sz="4"/>
+              <w:right w:val="single" w:color="CCCCCC" w:sz="4"/>
+            </w:tcBorders>
+            <w:shd w:fill="FFFFFF" w:val="clear"/>
+            <w:tcMar>
+              <w:top w:type="dxa" w:w="100"/>
+              <w:left w:type="dxa" w:w="140"/>
+              <w:bottom w:type="dxa" w:w="100"/>
+              <w:right w:type="dxa" w:w="140"/>
+            </w:tcMar>
+            <w:vAlign w:val="center"/>
+          </w:tcPr>
+          <w:p>
+            <w:pPr>
+              <w:spacing w:after="80" w:before="80"/>
+              <w:jc w:val="center"/>
+            </w:pPr>
+            <w:r>
+              <w:rPr>
+                <w:rFonts w:ascii="Arial" w:cs="Arial" w:eastAsia="Arial" w:hAnsi="Arial"/>
+                <w:b w:val="false"/>
+                <w:bCs w:val="false"/>
+                <w:i w:val="false"/>
+                <w:iCs w:val="false"/>
+                <w:color w:val="000000"/>
+                <w:sz w:val="21"/>
+                <w:szCs w:val="21"/>
+              </w:rPr>
+              <w:t xml:space="preserve">55–65%</w:t>
+            </w:r>
+          </w:p>
+        </w:tc>
+        <w:tc>
+          <w:tcPr>
+            <w:tcW w:type="dxa" w:w="3013"/>
+            <w:gridSpan w:val="1"/>
+            <w:tcBorders>
+              <w:top w:val="single" w:color="CCCCCC" w:sz="4"/>
+              <w:left w:val="single" w:color="CCCCCC" w:sz="4"/>
+              <w:bottom w:val="single" w:color="CCCCCC" w:sz="4"/>
+              <w:right w:val="single" w:color="CCCCCC" w:sz="4"/>
+            </w:tcBorders>
+            <w:shd w:fill="FFFFFF" w:val="clear"/>
+            <w:tcMar>
+              <w:top w:type="dxa" w:w="100"/>
+              <w:left w:type="dxa" w:w="140"/>
+              <w:bottom w:type="dxa" w:w="100"/>
+              <w:right w:type="dxa" w:w="140"/>
+            </w:tcMar>
+            <w:vAlign w:val="center"/>
+          </w:tcPr>
+          <w:p>
+            <w:pPr>
+              <w:spacing w:after="80" w:before="80"/>
+              <w:jc w:val="center"/>
+            </w:pPr>
+            <w:r>
+              <w:rPr>
+                <w:rFonts w:ascii="Arial" w:cs="Arial" w:eastAsia="Arial" w:hAnsi="Arial"/>
+                <w:b/>
+                <w:bCs/>
+                <w:i w:val="false"/>
+                <w:iCs w:val="false"/>
+                <w:color w:val="1A6B3A"/>
+                <w:sz w:val="21"/>
+                <w:szCs w:val="21"/>
+              </w:rPr>
+              <w:t xml:space="preserve">75–85%</w:t>
+            </w:r>
+          </w:p>
+        </w:tc>
+      </w:tr>
+      <w:tr>
+        <w:tc>
+          <w:tcPr>
+            <w:tcW w:type="dxa" w:w="3800"/>
+            <w:gridSpan w:val="1"/>
+            <w:tcBorders>
+              <w:top w:val="single" w:color="CCCCCC" w:sz="4"/>
+              <w:left w:val="single" w:color="CCCCCC" w:sz="4"/>
+              <w:bottom w:val="single" w:color="CCCCCC" w:sz="4"/>
+              <w:right w:val="single" w:color="CCCCCC" w:sz="4"/>
+            </w:tcBorders>
+            <w:shd w:fill="E8EEF7" w:val="clear"/>
+            <w:tcMar>
+              <w:top w:type="dxa" w:w="100"/>
+              <w:left w:type="dxa" w:w="140"/>
+              <w:bottom w:type="dxa" w:w="100"/>
+              <w:right w:type="dxa" w:w="140"/>
+            </w:tcMar>
+            <w:vAlign w:val="center"/>
+          </w:tcPr>
+          <w:p>
+            <w:pPr>
+              <w:spacing w:after="80" w:before="80"/>
+              <w:jc w:val="left"/>
+            </w:pPr>
+            <w:r>
+              <w:rPr>
+                <w:rFonts w:ascii="Arial" w:cs="Arial" w:eastAsia="Arial" w:hAnsi="Arial"/>
+                <w:b w:val="false"/>
+                <w:bCs w:val="false"/>
+                <w:i w:val="false"/>
+                <w:iCs w:val="false"/>
+                <w:color w:val="000000"/>
+                <w:sz w:val="21"/>
+                <w:szCs w:val="21"/>
+              </w:rPr>
+              <w:t xml:space="preserve">Clientes Venta 0 convertidos</w:t>
+            </w:r>
+          </w:p>
+        </w:tc>
+        <w:tc>
+          <w:tcPr>
+            <w:tcW w:type="dxa" w:w="2213"/>
+            <w:gridSpan w:val="1"/>
+            <w:tcBorders>
+              <w:top w:val="single" w:color="CCCCCC" w:sz="4"/>
+              <w:left w:val="single" w:color="CCCCCC" w:sz="4"/>
+              <w:bottom w:val="single" w:color="CCCCCC" w:sz="4"/>
+              <w:right w:val="single" w:color="CCCCCC" w:sz="4"/>
+            </w:tcBorders>
+            <w:shd w:fill="E8EEF7" w:val="clear"/>
+            <w:tcMar>
+              <w:top w:type="dxa" w:w="100"/>
+              <w:left w:type="dxa" w:w="140"/>
+              <w:bottom w:type="dxa" w:w="100"/>
+              <w:right w:type="dxa" w:w="140"/>
+            </w:tcMar>
+            <w:vAlign w:val="center"/>
+          </w:tcPr>
+          <w:p>
+            <w:pPr>
+              <w:spacing w:after="80" w:before="80"/>
+              <w:jc w:val="center"/>
+            </w:pPr>
+            <w:r>
+              <w:rPr>
+                <w:rFonts w:ascii="Arial" w:cs="Arial" w:eastAsia="Arial" w:hAnsi="Arial"/>
+                <w:b w:val="false"/>
+                <w:bCs w:val="false"/>
+                <w:i w:val="false"/>
+                <w:iCs w:val="false"/>
+                <w:color w:val="000000"/>
+                <w:sz w:val="21"/>
+                <w:szCs w:val="21"/>
+              </w:rPr>
+              <w:t xml:space="preserve">Sin seguimiento activo</w:t>
+            </w:r>
+          </w:p>
+        </w:tc>
+        <w:tc>
+          <w:tcPr>
+            <w:tcW w:type="dxa" w:w="3013"/>
+            <w:gridSpan w:val="1"/>
+            <w:tcBorders>
+              <w:top w:val="single" w:color="CCCCCC" w:sz="4"/>
+              <w:left w:val="single" w:color="CCCCCC" w:sz="4"/>
+              <w:bottom w:val="single" w:color="CCCCCC" w:sz="4"/>
+              <w:right w:val="single" w:color="CCCCCC" w:sz="4"/>
+            </w:tcBorders>
+            <w:shd w:fill="EAF4EE" w:val="clear"/>
+            <w:tcMar>
+              <w:top w:type="dxa" w:w="100"/>
+              <w:left w:type="dxa" w:w="140"/>
+              <w:bottom w:type="dxa" w:w="100"/>
+              <w:right w:type="dxa" w:w="140"/>
+            </w:tcMar>
+            <w:vAlign w:val="center"/>
+          </w:tcPr>
+          <w:p>
+            <w:pPr>
+              <w:spacing w:after="80" w:before="80"/>
+              <w:jc w:val="center"/>
+            </w:pPr>
+            <w:r>
+              <w:rPr>
+                <w:rFonts w:ascii="Arial" w:cs="Arial" w:eastAsia="Arial" w:hAnsi="Arial"/>
+                <w:b/>
+                <w:bCs/>
+                <w:i w:val="false"/>
+                <w:iCs w:val="false"/>
+                <w:color w:val="1A6B3A"/>
+                <w:sz w:val="21"/>
+                <w:szCs w:val="21"/>
+              </w:rPr>
+              <w:t xml:space="preserve">10–20% de la base inactiva</w:t>
+            </w:r>
+          </w:p>
+        </w:tc>
+      </w:tr>
+      <w:tr>
+        <w:tc>
+          <w:tcPr>
+            <w:tcW w:type="dxa" w:w="3800"/>
+            <w:gridSpan w:val="1"/>
+            <w:tcBorders>
+              <w:top w:val="single" w:color="CCCCCC" w:sz="4"/>
+              <w:left w:val="single" w:color="CCCCCC" w:sz="4"/>
+              <w:bottom w:val="single" w:color="CCCCCC" w:sz="4"/>
+              <w:right w:val="single" w:color="CCCCCC" w:sz="4"/>
+            </w:tcBorders>
+            <w:shd w:fill="FFFFFF" w:val="clear"/>
+            <w:tcMar>
+              <w:top w:type="dxa" w:w="100"/>
+              <w:left w:type="dxa" w:w="140"/>
+              <w:bottom w:type="dxa" w:w="100"/>
+              <w:right w:type="dxa" w:w="140"/>
+            </w:tcMar>
+            <w:vAlign w:val="center"/>
+          </w:tcPr>
+          <w:p>
+            <w:pPr>
+              <w:spacing w:after="80" w:before="80"/>
+              <w:jc w:val="left"/>
+            </w:pPr>
+            <w:r>
+              <w:rPr>
+                <w:rFonts w:ascii="Arial" w:cs="Arial" w:eastAsia="Arial" w:hAnsi="Arial"/>
+                <w:b w:val="false"/>
+                <w:bCs w:val="false"/>
+                <w:i w:val="false"/>
+                <w:iCs w:val="false"/>
+                <w:color w:val="000000"/>
+                <w:sz w:val="21"/>
+                <w:szCs w:val="21"/>
+              </w:rPr>
+              <w:t xml:space="preserve">Tasa de respuesta canal WhatsApp</w:t>
+            </w:r>
+          </w:p>
+        </w:tc>
+        <w:tc>
+          <w:tcPr>
+            <w:tcW w:type="dxa" w:w="2213"/>
+            <w:gridSpan w:val="1"/>
+            <w:tcBorders>
+              <w:top w:val="single" w:color="CCCCCC" w:sz="4"/>
+              <w:left w:val="single" w:color="CCCCCC" w:sz="4"/>
+              <w:bottom w:val="single" w:color="CCCCCC" w:sz="4"/>
+              <w:right w:val="single" w:color="CCCCCC" w:sz="4"/>
+            </w:tcBorders>
+            <w:shd w:fill="FFFFFF" w:val="clear"/>
+            <w:tcMar>
+              <w:top w:type="dxa" w:w="100"/>
+              <w:left w:type="dxa" w:w="140"/>
+              <w:bottom w:type="dxa" w:w="100"/>
+              <w:right w:type="dxa" w:w="140"/>
+            </w:tcMar>
+            <w:vAlign w:val="center"/>
+          </w:tcPr>
+          <w:p>
+            <w:pPr>
+              <w:spacing w:after="80" w:before="80"/>
+              <w:jc w:val="center"/>
+            </w:pPr>
+            <w:r>
+              <w:rPr>
+                <w:rFonts w:ascii="Arial" w:cs="Arial" w:eastAsia="Arial" w:hAnsi="Arial"/>
+                <w:b w:val="false"/>
+                <w:bCs w:val="false"/>
+                <w:i w:val="false"/>
+                <w:iCs w:val="false"/>
+                <w:color w:val="000000"/>
+                <w:sz w:val="21"/>
+                <w:szCs w:val="21"/>
+              </w:rPr>
+              <w:t xml:space="preserve">No existe</w:t>
+            </w:r>
+          </w:p>
+        </w:tc>
+        <w:tc>
+          <w:tcPr>
+            <w:tcW w:type="dxa" w:w="3013"/>
+            <w:gridSpan w:val="1"/>
+            <w:tcBorders>
+              <w:top w:val="single" w:color="CCCCCC" w:sz="4"/>
+              <w:left w:val="single" w:color="CCCCCC" w:sz="4"/>
+              <w:bottom w:val="single" w:color="CCCCCC" w:sz="4"/>
+              <w:right w:val="single" w:color="CCCCCC" w:sz="4"/>
+            </w:tcBorders>
+            <w:shd w:fill="FFFFFF" w:val="clear"/>
+            <w:tcMar>
+              <w:top w:type="dxa" w:w="100"/>
+              <w:left w:type="dxa" w:w="140"/>
+              <w:bottom w:type="dxa" w:w="100"/>
+              <w:right w:type="dxa" w:w="140"/>
+            </w:tcMar>
+            <w:vAlign w:val="center"/>
+          </w:tcPr>
+          <w:p>
+            <w:pPr>
+              <w:spacing w:after="80" w:before="80"/>
+              <w:jc w:val="center"/>
+            </w:pPr>
+            <w:r>
+              <w:rPr>
+                <w:rFonts w:ascii="Arial" w:cs="Arial" w:eastAsia="Arial" w:hAnsi="Arial"/>
+                <w:b/>
+                <w:bCs/>
+                <w:i w:val="false"/>
+                <w:iCs w:val="false"/>
+                <w:color w:val="1A6B3A"/>
+                <w:sz w:val="21"/>
+                <w:szCs w:val="21"/>
+              </w:rPr>
+              <w:t xml:space="preserve">35–55% de clientes contactados</w:t>
+            </w:r>
+          </w:p>
+        </w:tc>
+      </w:tr>
+    </w:tbl>
+    <w:p>
+      <w:pPr>
+        <w:spacing w:after="120" w:before="60"/>
+        <w:jc w:val="left"/>
+      </w:pPr>
+      <w:r>
+        <w:rPr>
+          <w:rFonts w:ascii="Arial" w:cs="Arial" w:eastAsia="Arial" w:hAnsi="Arial"/>
+          <w:b w:val="false"/>
+          <w:bCs w:val="false"/>
+          <w:i/>
+          <w:iCs/>
+          <w:color w:val="999999"/>
+          <w:sz w:val="18"/>
+          <w:szCs w:val="18"/>
+        </w:rPr>
+        <w:t xml:space="preserve">* Proyecciones basadas en benchmarks del sector. Los resultados reales dependen del tamaño de la operación, la base de clientes y la disciplina de uso del equipo comercial.</w:t>
+      </w:r>
+    </w:p>
+    <w:tbl>
+      <w:tblPr>
+        <w:tblW w:type="dxa" w:w="9026"/>
+        <w:tblBorders>
+          <w:top w:val="single" w:color="auto" w:sz="4"/>
+          <w:left w:val="single" w:color="auto" w:sz="4"/>
+          <w:bottom w:val="single" w:color="auto" w:sz="4"/>
+          <w:right w:val="single" w:color="auto" w:sz="4"/>
+          <w:insideH w:val="single" w:color="auto" w:sz="4"/>
+          <w:insideV w:val="single" w:color="auto" w:sz="4"/>
+        </w:tblBorders>
+      </w:tblPr>
+      <w:tblGrid>
+        <w:gridCol w:w="9026"/>
+      </w:tblGrid>
+      <w:tr>
+        <w:tc>
+          <w:tcPr>
+            <w:tcW w:type="dxa" w:w="9026"/>
+            <w:gridSpan w:val="1"/>
+            <w:tcBorders>
+              <w:top w:val="single" w:color="1B3A6B" w:sz="4"/>
+              <w:left w:val="single" w:color="1B3A6B" w:sz="4"/>
+              <w:bottom w:val="single" w:color="1B3A6B" w:sz="4"/>
+              <w:right w:val="single" w:color="1B3A6B" w:sz="4"/>
+            </w:tcBorders>
+            <w:shd w:fill="E8EEF7" w:val="clear"/>
+            <w:tcMar>
+              <w:top w:type="dxa" w:w="100"/>
+              <w:left w:type="dxa" w:w="140"/>
+              <w:bottom w:type="dxa" w:w="100"/>
+              <w:right w:type="dxa" w:w="140"/>
+            </w:tcMar>
+            <w:vAlign w:val="center"/>
+          </w:tcPr>
+          <w:p>
+            <w:pPr>
+              <w:spacing w:after="40" w:before="60"/>
+              <w:jc w:val="left"/>
+            </w:pPr>
+            <w:r>
+              <w:rPr>
+                <w:rFonts w:ascii="Arial" w:cs="Arial" w:eastAsia="Arial" w:hAnsi="Arial"/>
+                <w:b/>
+                <w:bCs/>
+                <w:i w:val="false"/>
+                <w:iCs w:val="false"/>
+                <w:color w:val="1B3A6B"/>
+                <w:sz w:val="22"/>
+                <w:szCs w:val="22"/>
+              </w:rPr>
+              <w:t xml:space="preserve">¿Qué significa esto en pesos?</w:t>
+            </w:r>
+          </w:p>
+          <w:p>
+            <w:pPr>
+              <w:spacing w:after="60" w:before="80"/>
+              <w:jc w:val="left"/>
+            </w:pPr>
+            <w:r>
+              <w:rPr>
+                <w:rFonts w:ascii="Arial" w:cs="Arial" w:eastAsia="Arial" w:hAnsi="Arial"/>
+                <w:b w:val="false"/>
+                <w:bCs w:val="false"/>
+                <w:i w:val="false"/>
+                <w:iCs w:val="false"/>
+                <w:color w:val="4A4A4A"/>
+                <w:sz w:val="22"/>
+                <w:szCs w:val="22"/>
+              </w:rPr>
+              <w:t xml:space="preserve">En una operación de 250 clientes activos, un incremento del 15% en frecuencia de compra con ticket promedio de $250.000 representa aproximadamente $9–12 millones adicionales por mes. Los pedidos recuperados en visitas no realizadas suman otros $6–8 millones. El costo del sistema es una fracción de ese impacto.</w:t>
+            </w:r>
+          </w:p>
+        </w:tc>
+      </w:tr>
+    </w:tbl>
+    <w:p>
+      <w:pPr>
+        <w:spacing w:after="80" w:before="120"/>
         <w:jc w:val="left"/>
       </w:pPr>
       <w:r>

</xml_diff>